<commit_message>
Record the score scale sensitivity and the per channel boundary, sections 4.1.1 and 4.1.3
</commit_message>
<xml_diff>
--- a/docx/【work2】胡宏彬-进度文档-20260825.docx
+++ b/docx/【work2】胡宏彬-进度文档-20260825.docx
@@ -22420,19 +22420,15 @@
         <w:t>切分。治理在通道级进行，每个窗口对应一个变量的一段连续观测。评测阶段把同一时间位置的多个通道重新组合成多变量块，用于多变量预测。计划的主语料规模为两千个窗口量级，其中划出独立的一部分作为策略学习的训练语料，其余用于评测，两者不重叠。</w:t>
       </w:r>
     </w:p>
-    <w:p/>
     <w:p>
-      <w:r>
-        <w:rPr>
-          <w:rFonts w:hint="eastAsia"/>
-        </w:rPr>
-        <w:t xml:space="preserve">4.1.2 </w:t>
-      </w:r>
-      <w:r>
-        <w:rPr>
-          <w:rFonts w:hint="eastAsia"/>
-        </w:rPr>
-        <w:t>缺陷注入与分层设计</w:t>
+      <w:pPr>
+        <w:ind w:firstLineChars="200" w:firstLine="420"/>
+      </w:pPr>
+      <w:r>
+        <w:rPr>
+          <w:rFonts w:hint="eastAsia"/>
+        </w:rPr>
+        <w:t xml:space="preserve">关于通道，本文的边界需要写明。治理在通道级进行，一个窗口是一个变量的一段连续观测，七类算子与行为探测都作用于一维序列。这一选择有其约束来源，本文所用的冻结基础模型均按通道独立处理输入，把多个通道一并送入并不会带来额外信息，只会改变聚合发生的位置。修复式清洗基线中的 MTCSC 使用其单变量分支，与本文同维度，因而对照是公平的。受保护层的标签按窗口标注，而窗口即单通道，因此按窗口标注与按通道标注在当前设定下是同一件事，损害的判定也不存在跨通道聚合的问题。评测阶段则把同一时间位置的多个通道重新组合为多变量块，采样器已支持这一重组。</w:t>
       </w:r>
     </w:p>
     <w:p>
@@ -22443,19 +22439,22 @@
         <w:rPr>
           <w:rFonts w:hint="eastAsia"/>
         </w:rPr>
-        <w:t>无标签场景下无法直接获得治理是否正确的判据，因此在干净窗口上注入受控噪声并逐条记录标签，把注入位置作为治理应当处理的对象。注入按</w:t>
-      </w:r>
-      <w:r>
-        <w:rPr>
-          <w:rFonts w:hint="eastAsia"/>
-        </w:rPr>
-        <w:t xml:space="preserve"> 2.2 </w:t>
-      </w:r>
-      <w:r>
-        <w:rPr>
-          <w:rFonts w:hint="eastAsia"/>
-        </w:rPr>
-        <w:t>节的划分分为两类。随机噪声在单个通道上注入，位置与幅度独立随机，覆盖孤立尖峰、散点缺失、连续缺失片段与重复片段四种形态。系统噪声在同一时间位置的多个通道上同时注入，覆盖水平位移、噪声放大与平台化三种形态，同一次注入的多个通道共享偏移方向。注入比例设置从百分之五到百分之六十七的多个档位，采用嵌套构造，即高比例语料包含低比例语料的全部受污染窗口，干净部分保持不变，使不同比例之间的差异只来自比例本身。</w:t>
+        <w:t xml:space="preserve">由此留下的一处未覆盖的失效模式一并写明。逐通道修复可能破坏通道之间的相关结构，而每个通道单独来看都正常。金融语料中这一风险更实在，利率曲线的数十个通道之间存在真实联动。本文的结构失真度量目前只在单个通道内比较修复前后的时序属性，不含跨通道分量，因此无法检出这类破坏。这一点记入 6.1 节，作为后续工作的一个明确方向。</w:t>
+      </w:r>
+    </w:p>
+    <w:p/>
+    <w:p>
+      <w:r>
+        <w:rPr>
+          <w:rFonts w:hint="eastAsia"/>
+        </w:rPr>
+        <w:t xml:space="preserve">4.1.2 </w:t>
+      </w:r>
+      <w:r>
+        <w:rPr>
+          <w:rFonts w:hint="eastAsia"/>
+        </w:rPr>
+        <w:t>缺陷注入与分层设计</w:t>
       </w:r>
     </w:p>
     <w:p>
@@ -22466,7 +22465,19 @@
         <w:rPr>
           <w:rFonts w:hint="eastAsia"/>
         </w:rPr>
-        <w:t>评测集按窗口的来源与是否被注入分为四层。注入层是施加了上述两类噪声的窗口，治理应当处理它们。干净层未做任何注入，治理不应改动它们。稀有层从真实数据中筛选，取的是取值落在分布尾部但完全未经注入的窗口，金融语料中的剧烈波动时段与工业语料中的启停时段都属于此类。困难层同样来自真实数据，取季节强度与自相关都较低因而难以预测但完全干净的窗口。后两层与干净层统称受保护层，其上的任何编辑都计为损害。稀有层与困难层取自数据本身而不是合成构造，这样保护对象的定义不依赖于注入过程，避免了设计缺陷同时又设计保护对象所带来的循环。</w:t>
+        <w:t>无标签场景下无法直接获得治理是否正确的判据，因此在干净窗口上注入受控噪声并逐条记录标签，把注入位置作为治理应当处理的对象。注入按</w:t>
+      </w:r>
+      <w:r>
+        <w:rPr>
+          <w:rFonts w:hint="eastAsia"/>
+        </w:rPr>
+        <w:t xml:space="preserve"> 2.2 </w:t>
+      </w:r>
+      <w:r>
+        <w:rPr>
+          <w:rFonts w:hint="eastAsia"/>
+        </w:rPr>
+        <w:t>节的划分分为两类。随机噪声在单个通道上注入，位置与幅度独立随机，覆盖孤立尖峰、散点缺失、连续缺失片段与重复片段四种形态。系统噪声在同一时间位置的多个通道上同时注入，覆盖水平位移、噪声放大与平台化三种形态，同一次注入的多个通道共享偏移方向。注入比例设置从百分之五到百分之六十七的多个档位，采用嵌套构造，即高比例语料包含低比例语料的全部受污染窗口，干净部分保持不变，使不同比例之间的差异只来自比例本身。</w:t>
       </w:r>
     </w:p>
     <w:p>
@@ -22477,7 +22488,7 @@
         <w:rPr>
           <w:rFonts w:hint="eastAsia"/>
         </w:rPr>
-        <w:t xml:space="preserve">稀有层与变点层由筛选给出而不是由构造给出，两层的判据在任何筛选结果产生之前写定。稀有层要求窗口触及该通道自身取值分布的尾部、越尾点占比不超过窗口的百分之五、且首尾四分位的中位数之差不超过半个四分位距，三条合起来刻画的是一次幅度大、持续短、并回到基线的真实事件。变点层取分段均值之差除以合并的段内标准差这一统计量，在尺度保持且不同时属于稀有层的窗口中，按族内秩取前若干。</w:t>
+        <w:t>评测集按窗口的来源与是否被注入分为四层。注入层是施加了上述两类噪声的窗口，治理应当处理它们。干净层未做任何注入，治理不应改动它们。稀有层从真实数据中筛选，取的是取值落在分布尾部但完全未经注入的窗口，金融语料中的剧烈波动时段与工业语料中的启停时段都属于此类。困难层同样来自真实数据，取季节强度与自相关都较低因而难以预测但完全干净的窗口。后两层与干净层统称受保护层，其上的任何编辑都计为损害。稀有层与困难层取自数据本身而不是合成构造，这样保护对象的定义不依赖于注入过程，避免了设计缺陷同时又设计保护对象所带来的循环。</w:t>
       </w:r>
     </w:p>
     <w:p>
@@ -22488,7 +22499,7 @@
         <w:rPr>
           <w:rFonts w:hint="eastAsia"/>
         </w:rPr>
-        <w:t xml:space="preserve">变点层采用秩而不是阈值，理由来自一次实测而不是偏好。该统计量在三种单位下各测了两族每族 400 个窗口，没有一种单位能把两类语料放到同一尺度上，金融语料在分块稳健尺度与合并段内标准差两个单位下的中位数，都高于工业语料的九十分位。这不是阈值松紧的问题而是数据本身的性质，利率曲线的整体平移是每周都会发生的事，而变压器改变运行状态不是。任何单一阈值因此要么在工业语料上几乎筛不出东西，要么在金融语料上几乎全部收入。秩对单调重标度不变，两族各按自身分布取前若干，这与窗口筛选中以同通道同长度窗口的典型尺度作参照是同一个理由。</w:t>
+        <w:t xml:space="preserve">稀有层与变点层由筛选给出而不是由构造给出，两层的判据在任何筛选结果产生之前写定。稀有层要求窗口触及该通道自身取值分布的尾部、越尾点占比不超过窗口的百分之五、且首尾四分位的中位数之差不超过半个四分位距，三条合起来刻画的是一次幅度大、持续短、并回到基线的真实事件。变点层取分段均值之差除以合并的段内标准差这一统计量，在尺度保持且不同时属于稀有层的窗口中，按族内秩取前若干。</w:t>
       </w:r>
     </w:p>
     <w:p>
@@ -22499,7 +22510,7 @@
         <w:rPr>
           <w:rFonts w:hint="eastAsia"/>
         </w:rPr>
-        <w:t xml:space="preserve">两版判据的对照可以说明这一改动的必要性。以绝对阈值表达时，1600 个窗口的池中只筛出 4 个变点窗口，六个数据集中有四个一个也没有。改为族内秩之后筛出 180 个，六个数据集全部提供该层，两族均无缺口。这一对照支撑本节关于稀有层与变点层取自数据本身而不是合成构造的表述，若该层只能靠合成构造填满，则设计缺陷者同时设计保护对象这一质疑仍然成立。</w:t>
+        <w:t xml:space="preserve">变点层采用秩而不是阈值，理由来自一次实测而不是偏好。该统计量在三种单位下各测了两族每族 400 个窗口，没有一种单位能把两类语料放到同一尺度上，金融语料在分块稳健尺度与合并段内标准差两个单位下的中位数，都高于工业语料的九十分位。这不是阈值松紧的问题而是数据本身的性质，利率曲线的整体平移是每周都会发生的事，而变压器改变运行状态不是。任何单一阈值因此要么在工业语料上几乎筛不出东西，要么在金融语料上几乎全部收入。秩对单调重标度不变，两族各按自身分布取前若干，这与窗口筛选中以同通道同长度窗口的典型尺度作参照是同一个理由。</w:t>
       </w:r>
     </w:p>
     <w:p>
@@ -22510,7 +22521,7 @@
         <w:rPr>
           <w:rFonts w:hint="eastAsia"/>
         </w:rPr>
-        <w:t xml:space="preserve">秩规则的代价一并写明。它总会返回结果，因而无法报告某类语料确实不存在合法变点，绝对阈值可以而它不能。作为补偿，选中层的统计量分布与注入水平位移之后的同一统计量分布并列报告，若两者相差很远，则该层是比它自称更弱的检验，无论结果如何都如实给出。</w:t>
+        <w:t xml:space="preserve">两版判据的对照可以说明这一改动的必要性。以绝对阈值表达时，1600 个窗口的池中只筛出 4 个变点窗口，六个数据集中有四个一个也没有。改为族内秩之后筛出 180 个，六个数据集全部提供该层，两族均无缺口。这一对照支撑本节关于稀有层与变点层取自数据本身而不是合成构造的表述，若该层只能靠合成构造填满，则设计缺陷者同时设计保护对象这一质疑仍然成立。</w:t>
       </w:r>
     </w:p>
     <w:p>
@@ -22521,7 +22532,7 @@
         <w:rPr>
           <w:rFonts w:hint="eastAsia"/>
         </w:rPr>
-        <w:t xml:space="preserve">困难层的判据同样经过一次修正，其理由是定义错误而不是某一族筛不出窗口。原判据取季节强度与短滞后自相关的补，而接近随机游走的序列这两项都很高，于是被判为容易，随机游走却是预测问题中的经典困难例，统计量与它所命名的概念方向相反。这一判断独立于语料构成，在一份没有金融数据的语料上同样成立。现判据直接由可预测性定义困难，取差分序列上线性自回归所能解释的方差占比，以其补作为难度，这一形式对重标度不变，且与 2.2 节关于行为信号度量的是可预测程度这一表述相一致，原判据恰恰在窗口难以预测时称其容易，两处此前是矛盾的。</w:t>
+        <w:t xml:space="preserve">秩规则的代价一并写明。它总会返回结果，因而无法报告某类语料确实不存在合法变点，绝对阈值可以而它不能。作为补偿，选中层的统计量分布与注入水平位移之后的同一统计量分布并列报告，若两者相差很远，则该层是比它自称更弱的检验，无论结果如何都如实给出。</w:t>
       </w:r>
     </w:p>
     <w:p>
@@ -22532,7 +22543,7 @@
         <w:rPr>
           <w:rFonts w:hint="eastAsia"/>
         </w:rPr>
-        <w:t xml:space="preserve">两版判据在两类语料上的分布对照本身就是新判据正确的证据。原判据下工业与金融的难度中位分别为 0.1905 与 0.0105，相差十八倍，且方向与实际的预测难度相反。新判据下两者为 0.8338 与 0.9151，相差在一成以内，方向一致。新判据下金融仍略高于工业，这一位移按信号处理而不是按误差处理，金融价格序列比设备遥测更接近随机游走，一个能正确识别随机游走为困难的统计量本就应当把它们排得更高。由于金融的五分位数高于工业的二十五分位数，全局排序会使该层几乎只来自一类语料，因此困难层同样采用族内秩。</w:t>
+        <w:t xml:space="preserve">困难层的判据同样经过一次修正，其理由是定义错误而不是某一族筛不出窗口。原判据取季节强度与短滞后自相关的补，而接近随机游走的序列这两项都很高，于是被判为容易，随机游走却是预测问题中的经典困难例，统计量与它所命名的概念方向相反。这一判断独立于语料构成，在一份没有金融数据的语料上同样成立。现判据直接由可预测性定义困难，取差分序列上线性自回归所能解释的方差占比，以其补作为难度，这一形式对重标度不变，且与 2.2 节关于行为信号度量的是可预测程度这一表述相一致，原判据恰恰在窗口难以预测时称其容易，两处此前是矛盾的。</w:t>
       </w:r>
     </w:p>
     <w:p>
@@ -22543,22 +22554,7 @@
         <w:rPr>
           <w:rFonts w:hint="eastAsia"/>
         </w:rPr>
-        <w:t xml:space="preserve">稀有层存在一处程度较轻的来源偏向，如实写明而不作修正。各数据集的合格率相差很大，工业在 0.075 至 0.173 之间，金融在 0.015 至 0.043 之间，其中池规模最大的一项合格率反而最低，仅为 0.015，约为最高者的十一分之一。这说明缺口不是配额与池规模不匹配，而是判据在各数据集上的自然产出差异。机制来自判据中回到基线这一条，它要求窗口首尾四分位的中位数之差不超过半个四分位距，而金融序列普遍带有趋势，首尾差距因此常常超出该限。该层由此偏向工业语料，但金融仍有贡献，在 201 个窗口中占 37 个。</w:t>
-      </w:r>
-    </w:p>
-    <w:p/>
-    <w:p>
-      <w:r>
-        <w:rPr>
-          <w:rFonts w:hint="eastAsia"/>
-        </w:rPr>
-        <w:t xml:space="preserve">4.1.3 </w:t>
-      </w:r>
-      <w:r>
-        <w:rPr>
-          <w:rFonts w:hint="eastAsia"/>
-        </w:rPr>
-        <w:t>基线方法</w:t>
+        <w:t xml:space="preserve">两版判据在两类语料上的分布对照本身就是新判据正确的证据。原判据下工业与金融的难度中位分别为 0.1905 与 0.0105，相差十八倍，且方向与实际的预测难度相反。新判据下两者为 0.8338 与 0.9151，相差在一成以内，方向一致。新判据下金融仍略高于工业，这一位移按信号处理而不是按误差处理，金融价格序列比设备遥测更接近随机游走，一个能正确识别随机游走为困难的统计量本就应当把它们排得更高。由于金融的五分位数高于工业的二十五分位数，全局排序会使该层几乎只来自一类语料，因此困难层同样采用族内秩。</w:t>
       </w:r>
     </w:p>
     <w:p>
@@ -22569,7 +22565,22 @@
         <w:rPr>
           <w:rFonts w:hint="eastAsia"/>
         </w:rPr>
-        <w:t xml:space="preserve">基线的选取有三条标准。每一项都有可查证的正式发表出处，全部基线合起来覆盖问题所处的两个方法族，每一项都隔离出其余各项不涉及的一个变量。按这三条筛选后保留八项，非消融实验的表格一律列全这八项，某项若因协议不适用而缺列，在表中标注不适用并于表注说明理由，不得省略该行。</w:t>
+        <w:t xml:space="preserve">稀有层存在一处程度较轻的来源偏向，如实写明而不作修正。各数据集的合格率相差很大，工业在 0.075 至 0.173 之间，金融在 0.015 至 0.043 之间，其中池规模最大的一项合格率反而最低，仅为 0.015，约为最高者的十一分之一。这说明缺口不是配额与池规模不匹配，而是判据在各数据集上的自然产出差异。机制来自判据中回到基线这一条，它要求窗口首尾四分位的中位数之差不超过半个四分位距，而金融序列普遍带有趋势，首尾差距因此常常超出该限。该层由此偏向工业语料，但金融仍有贡献，在 201 个窗口中占 37 个。</w:t>
+      </w:r>
+    </w:p>
+    <w:p/>
+    <w:p>
+      <w:r>
+        <w:rPr>
+          <w:rFonts w:hint="eastAsia"/>
+        </w:rPr>
+        <w:t xml:space="preserve">4.1.3 </w:t>
+      </w:r>
+      <w:r>
+        <w:rPr>
+          <w:rFonts w:hint="eastAsia"/>
+        </w:rPr>
+        <w:t>基线方法</w:t>
       </w:r>
     </w:p>
     <w:p>
@@ -22580,115 +22591,7 @@
         <w:rPr>
           <w:rFonts w:hint="eastAsia"/>
         </w:rPr>
-        <w:t>（</w:t>
-      </w:r>
-      <w:r>
-        <w:rPr>
-          <w:rFonts w:hint="eastAsia"/>
-        </w:rPr>
-        <w:t>1</w:t>
-      </w:r>
-      <w:r>
-        <w:rPr>
-          <w:rFonts w:hint="eastAsia"/>
-        </w:rPr>
-        <w:t>）不治理，作为参照下界，其损害恒为零，用于确认任何非零损害都来自方法本身，与评测流程无关。（</w:t>
-      </w:r>
-      <w:r>
-        <w:rPr>
-          <w:rFonts w:hint="eastAsia"/>
-        </w:rPr>
-        <w:t>2</w:t>
-      </w:r>
-      <w:r>
-        <w:rPr>
-          <w:rFonts w:hint="eastAsia"/>
-        </w:rPr>
-        <w:t>）</w:t>
-      </w:r>
-      <w:r>
-        <w:rPr>
-          <w:rFonts w:hint="eastAsia"/>
-        </w:rPr>
-        <w:t>SCREEN[5]</w:t>
-      </w:r>
-      <w:r>
-        <w:rPr>
-          <w:rFonts w:hint="eastAsia"/>
-        </w:rPr>
-        <w:t>，速度约束下的局部最优修复，代表约束驱动的清洗路线，隔离的变量是修复规则完全由领域约束给定时能走到哪里。（</w:t>
-      </w:r>
-      <w:r>
-        <w:rPr>
-          <w:rFonts w:hint="eastAsia"/>
-        </w:rPr>
-        <w:t>3</w:t>
-      </w:r>
-      <w:r>
-        <w:rPr>
-          <w:rFonts w:hint="eastAsia"/>
-        </w:rPr>
-        <w:t>）</w:t>
-      </w:r>
-      <w:r>
-        <w:rPr>
-          <w:rFonts w:hint="eastAsia"/>
-        </w:rPr>
-        <w:t>IMR[6]</w:t>
-      </w:r>
-      <w:r>
-        <w:rPr>
-          <w:rFonts w:hint="eastAsia"/>
-        </w:rPr>
-        <w:t>，自回归模型迭代修复，代表统计建模驱动的清洗路线，隔离的变量是把修复依据从人工约束换成数据自身的统计结构。（</w:t>
-      </w:r>
-      <w:r>
-        <w:rPr>
-          <w:rFonts w:hint="eastAsia"/>
-        </w:rPr>
-        <w:t>4</w:t>
-      </w:r>
-      <w:r>
-        <w:rPr>
-          <w:rFonts w:hint="eastAsia"/>
-        </w:rPr>
-        <w:t>）</w:t>
-      </w:r>
-      <w:r>
-        <w:rPr>
-          <w:rFonts w:hint="eastAsia"/>
-        </w:rPr>
-        <w:t>MTCSC[8]</w:t>
-      </w:r>
-      <w:r>
-        <w:rPr>
-          <w:rFonts w:hint="eastAsia"/>
-        </w:rPr>
-        <w:t>的单变量分支，</w:t>
-      </w:r>
-      <w:r>
-        <w:rPr>
-          <w:rFonts w:hint="eastAsia"/>
-        </w:rPr>
-        <w:t xml:space="preserve">2024 </w:t>
-      </w:r>
-      <w:r>
-        <w:rPr>
-          <w:rFonts w:hint="eastAsia"/>
-        </w:rPr>
-        <w:t>年的速度约束工作，它与</w:t>
-      </w:r>
-      <w:r>
-        <w:rPr>
-          <w:rFonts w:hint="eastAsia"/>
-        </w:rPr>
-        <w:t xml:space="preserve"> SCREEN </w:t>
-      </w:r>
-      <w:r>
-        <w:rPr>
-          <w:rFonts w:hint="eastAsia"/>
-        </w:rPr>
-        <w:t>的编辑重合度分窗口、改动位置与修复取值三个层次实测，三个层次都高度一致才合并为一行，否则各自单列。</w:t>
+        <w:t xml:space="preserve">基线的选取有三条标准。每一项都有可查证的正式发表出处，全部基线合起来覆盖问题所处的两个方法族，每一项都隔离出其余各项不涉及的一个变量。按这三条筛选后保留八项，非消融实验的表格一律列全这八项，某项若因协议不适用而缺列，在表中标注不适用并于表注说明理由，不得省略该行。</w:t>
       </w:r>
     </w:p>
     <w:p>
@@ -22699,7 +22602,115 @@
         <w:rPr>
           <w:rFonts w:hint="eastAsia"/>
         </w:rPr>
-        <w:t xml:space="preserve">（5）TimeInf[11]，把影响函数定义在时间块上再聚合到时间点，代表打分式选择路线中面向时序设计的一支。（6）Data-OOB[10]，用袋外估计给出样本价值，隔离的变量是估值方法忽略时间依赖时会损失什么。（7）LTSV[29]，在冻结的时序基础模型上做一步上下文微调，以留出上下文损失的下降量作为片段取值，再按时间块聚合到窗口，隔离的变量是估值直接建立在基础模型行为之上而不是建立在一个替代回归模型之上。该项与本文的取证环节最为接近，两者都读取冻结模型对一个窗口的反应，差别在于它只据此给出分数，本文据此选择并裁决一次编辑。打分族的其余工作在产出形式上一致，都给样本分数再按分数取舍，彼此的差别在估值器而不在产出，而本文的比较发生在整备后语料这一层，因此 Data Shapley 与 KNN Shapley 不单列，前者与 Data-OOB 同属博弈论估值而开销高出一个量级。（8）学习策略不配屏蔽，即把算子直接作用于原数据，代表同期强化学习清洗方案的做法，隔离的变量是屏蔽本身的有无。</w:t>
+        <w:t>（</w:t>
+      </w:r>
+      <w:r>
+        <w:rPr>
+          <w:rFonts w:hint="eastAsia"/>
+        </w:rPr>
+        <w:t>1</w:t>
+      </w:r>
+      <w:r>
+        <w:rPr>
+          <w:rFonts w:hint="eastAsia"/>
+        </w:rPr>
+        <w:t>）不治理，作为参照下界，其损害恒为零，用于确认任何非零损害都来自方法本身，与评测流程无关。（</w:t>
+      </w:r>
+      <w:r>
+        <w:rPr>
+          <w:rFonts w:hint="eastAsia"/>
+        </w:rPr>
+        <w:t>2</w:t>
+      </w:r>
+      <w:r>
+        <w:rPr>
+          <w:rFonts w:hint="eastAsia"/>
+        </w:rPr>
+        <w:t>）</w:t>
+      </w:r>
+      <w:r>
+        <w:rPr>
+          <w:rFonts w:hint="eastAsia"/>
+        </w:rPr>
+        <w:t>SCREEN[5]</w:t>
+      </w:r>
+      <w:r>
+        <w:rPr>
+          <w:rFonts w:hint="eastAsia"/>
+        </w:rPr>
+        <w:t>，速度约束下的局部最优修复，代表约束驱动的清洗路线，隔离的变量是修复规则完全由领域约束给定时能走到哪里。（</w:t>
+      </w:r>
+      <w:r>
+        <w:rPr>
+          <w:rFonts w:hint="eastAsia"/>
+        </w:rPr>
+        <w:t>3</w:t>
+      </w:r>
+      <w:r>
+        <w:rPr>
+          <w:rFonts w:hint="eastAsia"/>
+        </w:rPr>
+        <w:t>）</w:t>
+      </w:r>
+      <w:r>
+        <w:rPr>
+          <w:rFonts w:hint="eastAsia"/>
+        </w:rPr>
+        <w:t>IMR[6]</w:t>
+      </w:r>
+      <w:r>
+        <w:rPr>
+          <w:rFonts w:hint="eastAsia"/>
+        </w:rPr>
+        <w:t>，自回归模型迭代修复，代表统计建模驱动的清洗路线，隔离的变量是把修复依据从人工约束换成数据自身的统计结构。（</w:t>
+      </w:r>
+      <w:r>
+        <w:rPr>
+          <w:rFonts w:hint="eastAsia"/>
+        </w:rPr>
+        <w:t>4</w:t>
+      </w:r>
+      <w:r>
+        <w:rPr>
+          <w:rFonts w:hint="eastAsia"/>
+        </w:rPr>
+        <w:t>）</w:t>
+      </w:r>
+      <w:r>
+        <w:rPr>
+          <w:rFonts w:hint="eastAsia"/>
+        </w:rPr>
+        <w:t>MTCSC[8]</w:t>
+      </w:r>
+      <w:r>
+        <w:rPr>
+          <w:rFonts w:hint="eastAsia"/>
+        </w:rPr>
+        <w:t>的单变量分支，</w:t>
+      </w:r>
+      <w:r>
+        <w:rPr>
+          <w:rFonts w:hint="eastAsia"/>
+        </w:rPr>
+        <w:t xml:space="preserve">2024 </w:t>
+      </w:r>
+      <w:r>
+        <w:rPr>
+          <w:rFonts w:hint="eastAsia"/>
+        </w:rPr>
+        <w:t>年的速度约束工作，它与</w:t>
+      </w:r>
+      <w:r>
+        <w:rPr>
+          <w:rFonts w:hint="eastAsia"/>
+        </w:rPr>
+        <w:t xml:space="preserve"> SCREEN </w:t>
+      </w:r>
+      <w:r>
+        <w:rPr>
+          <w:rFonts w:hint="eastAsia"/>
+        </w:rPr>
+        <w:t>的编辑重合度分窗口、改动位置与修复取值三个层次实测，三个层次都高度一致才合并为一行，否则各自单列。</w:t>
       </w:r>
     </w:p>
     <w:p>
@@ -22710,7 +22721,7 @@
         <w:rPr>
           <w:rFonts w:hint="eastAsia"/>
         </w:rPr>
-        <w:t>上述基线分属不同族，产出形式不同，因此采用两套协议以保证每一项都能参与比较。语料层协议下各方法产出整备后的语料，用同一下游模型训练并报同一组指标，打分族与清洗族在此层完全可比。候选层协议用于需要逐动作裁决的分析，例如接受率与撤销原因的拆解，参与者为清洗族与本文方法，打分族不产出逐动作决策，在此层标注为不适用。</w:t>
+        <w:t xml:space="preserve">（5）TimeInf[11]，把影响函数定义在时间块上再聚合到时间点，代表打分式选择路线中面向时序设计的一支。（6）Data-OOB[10]，用袋外估计给出样本价值，隔离的变量是估值方法忽略时间依赖时会损失什么。（7）LTSV[29]，在冻结的时序基础模型上做一步上下文微调，以留出上下文损失的下降量作为片段取值，再按时间块聚合到窗口，隔离的变量是估值直接建立在基础模型行为之上而不是建立在一个替代回归模型之上。该项与本文的取证环节最为接近，两者都读取冻结模型对一个窗口的反应，差别在于它只据此给出分数，本文据此选择并裁决一次编辑。打分族的其余工作在产出形式上一致，都给样本分数再按分数取舍，彼此的差别在估值器而不在产出，而本文的比较发生在整备后语料这一层，因此 Data Shapley 与 KNN Shapley 不单列，前者与 Data-OOB 同属博弈论估值而开销高出一个量级。（8）学习策略不配屏蔽，即把算子直接作用于原数据，代表同期强化学习清洗方案的做法，隔离的变量是屏蔽本身的有无。</w:t>
       </w:r>
     </w:p>
     <w:p>
@@ -22721,7 +22732,7 @@
         <w:rPr>
           <w:rFonts w:hint="eastAsia"/>
         </w:rPr>
-        <w:t xml:space="preserve">软惩罚、单信号屏蔽、规约式否决与无屏蔽这几种对照不计入基线清单，它们改变的是本文方法内部的一个环节而不是一个独立的已发表方法。它们各自出现的位置按其所隔离的环节确定。软惩罚与单信号屏蔽出现在实验一，那一组要问的是判据本身是否有效，前者把结构约束写成目标函数中的惩罚项，后者只保留效用一路信号，两者与合取判据的差别正是该组要度量的东西。无屏蔽与规约式否决出现在实验二与消融，前者是消融的第一档，后者用于说明事先写定的规约在无标签场景下无法给出阈值。随机策略出现在实验三，作为策略学习收益的下界。这一安排使每种对照只在它能说明问题的那一组里出现，而不是在每张表里重复列出。消融只含本文方法的各档变体，不含基线。</w:t>
+        <w:t>上述基线分属不同族，产出形式不同，因此采用两套协议以保证每一项都能参与比较。语料层协议下各方法产出整备后的语料，用同一下游模型训练并报同一组指标，打分族与清洗族在此层完全可比。候选层协议用于需要逐动作裁决的分析，例如接受率与撤销原因的拆解，参与者为清洗族与本文方法，打分族不产出逐动作决策，在此层标注为不适用。</w:t>
       </w:r>
     </w:p>
     <w:p>
@@ -22732,7 +22743,7 @@
         <w:rPr>
           <w:rFonts w:hint="eastAsia"/>
         </w:rPr>
-        <w:t xml:space="preserve">TSRating[12]不进入基线清单，理由是一次实测而不是可得性的笼统说法。该方法从大模型的成对判断蒸馏出评分器，其可用性取决于判断本身是否稳定，因此在任何标注开始之前先做了一次一致性检查，模板、序列化、生成次数与解析全部沿用原仓库，只替换判断后端。取 15 对窗口，每对以正反两种呈现顺序各判断 20 次，覆盖趋势、频率、幅度与模式四个维度。结果是交换呈现顺序之后偏好翻转的比例为 0.508，即与抛硬币无异。机制可以直接读出，把两种顺序合起来统计，73.6% 的票投给了排在前面的那个选项，中位数为 76.0%，60 个配对维度中有 17 个的首位得票率不低于 90%，这是位置偏好而不是判断。该方法自带的两序平均也未能挽回，平均之后有 24 个配对维度落在它自己视为未决的区间内。需要限定的是，这是关于后端替换的结论而不是关于该方法的结论，原文在其所用的判断后端上报告结果，此处确立的是所替换的后端在该配置下不复现该方法所假定的判断行为。</w:t>
+        <w:t xml:space="preserve">软惩罚、单信号屏蔽、规约式否决与无屏蔽这几种对照不计入基线清单，它们改变的是本文方法内部的一个环节而不是一个独立的已发表方法。它们各自出现的位置按其所隔离的环节确定。软惩罚与单信号屏蔽出现在实验一，那一组要问的是判据本身是否有效，前者把结构约束写成目标函数中的惩罚项，后者只保留效用一路信号，两者与合取判据的差别正是该组要度量的东西。无屏蔽与规约式否决出现在实验二与消融，前者是消融的第一档，后者用于说明事先写定的规约在无标签场景下无法给出阈值。随机策略出现在实验三，作为策略学习收益的下界。这一安排使每种对照只在它能说明问题的那一组里出现，而不是在每张表里重复列出。消融只含本文方法的各档变体，不含基线。</w:t>
       </w:r>
     </w:p>
     <w:p>
@@ -22743,7 +22754,7 @@
         <w:rPr>
           <w:rFonts w:hint="eastAsia"/>
         </w:rPr>
-        <w:t xml:space="preserve">这一检查同时给出了一个与主表计算开销一列直接相关的数字。按实测的每对每维开销外推，两千窗口乘四个维度约需 16000 个配对维度，折合约 2100 元与 32 小时。依赖外部大模型判断的方法因而在语料规模上存在成本门槛，而本文的证据来自对冻结模型的前向探测，其开销随语料线性增长且不涉及外部服务。这一对照是主表保留计算开销一列的实测依据之一。</w:t>
+        <w:t xml:space="preserve">TSRating[12]不进入基线清单，理由是一次实测而不是可得性的笼统说法。该方法从大模型的成对判断蒸馏出评分器，其可用性取决于判断本身是否稳定，因此在任何标注开始之前先做了一次一致性检查，模板、序列化、生成次数与解析全部沿用原仓库，只替换判断后端。取 15 对窗口，每对以正反两种呈现顺序各判断 20 次，覆盖趋势、频率、幅度与模式四个维度。结果是交换呈现顺序之后偏好翻转的比例为 0.508，即与抛硬币无异。机制可以直接读出，把两种顺序合起来统计，73.6% 的票投给了排在前面的那个选项，中位数为 76.0%，60 个配对维度中有 17 个的首位得票率不低于 90%，这是位置偏好而不是判断。该方法自带的两序平均也未能挽回，平均之后有 24 个配对维度落在它自己视为未决的区间内。需要限定的是，这是关于后端替换的结论而不是关于该方法的结论，原文在其所用的判断后端上报告结果，此处确立的是所替换的后端在该配置下不复现该方法所假定的判断行为。</w:t>
       </w:r>
     </w:p>
     <w:p>
@@ -22754,7 +22765,7 @@
         <w:rPr>
           <w:rFonts w:hint="eastAsia"/>
         </w:rPr>
-        <w:t xml:space="preserve">该后端的推理模式单独试过一次，结论是这条路同样不通，但失效方式不同，因此一并记下。打开推理之后可计分的配对全部一致，翻转率为零，但可计分的只有 24 个配对维度中的 16 个，不可计分率为 0.333，零翻转因而不能单独作为结论。逐条查看原始回复可以定性，失败并非模型给不出判断，也不是回复格式不符，而是推理占满了输出预算。一个典型的不可计分样本上，第一次生成的结束原因为长度，推理消耗 2048 个 token 而正文为空，同一配对的第二次生成推理消耗 416 个 token 并正常给出判断。这意味着被丢弃的恰是模型推理更长的那些配对，而推理更长通常对应更难判断的配对，于是留下的是模型觉得容易的那一部分，零翻转属于幸存者偏差。两个数字因此必须同时报告，关闭推理时翻转率 0.508 而不可计分率为零，打开推理时翻转率为零而不可计分率 0.333。两种配置的唯一差异是输出上限由 8 提高到 2048，这一改动由模式本身强制而非选择，关闭推理时每次调用的推理开销约 23 个 token，打开后约 1440 个。该项到此为止，不再追加分支，TSRating 因而不进入基线清单，在全基线表中保留该行并标注不适用及上述理由。</w:t>
+        <w:t xml:space="preserve">这一检查同时给出了一个与主表计算开销一列直接相关的数字。按实测的每对每维开销外推，两千窗口乘四个维度约需 16000 个配对维度，折合约 2100 元与 32 小时。依赖外部大模型判断的方法因而在语料规模上存在成本门槛，而本文的证据来自对冻结模型的前向探测，其开销随语料线性增长且不涉及外部服务。这一对照是主表保留计算开销一列的实测依据之一。</w:t>
       </w:r>
     </w:p>
     <w:p>
@@ -22765,7 +22776,51 @@
         <w:rPr>
           <w:rFonts w:hint="eastAsia"/>
         </w:rPr>
+        <w:t xml:space="preserve">该后端的推理模式单独试过一次，结论是这条路同样不通，但失效方式不同，因此一并记下。打开推理之后可计分的配对全部一致，翻转率为零，但可计分的只有 24 个配对维度中的 16 个，不可计分率为 0.333，零翻转因而不能单独作为结论。逐条查看原始回复可以定性，失败并非模型给不出判断，也不是回复格式不符，而是推理占满了输出预算。一个典型的不可计分样本上，第一次生成的结束原因为长度，推理消耗 2048 个 token 而正文为空，同一配对的第二次生成推理消耗 416 个 token 并正常给出判断。这意味着被丢弃的恰是模型推理更长的那些配对，而推理更长通常对应更难判断的配对，于是留下的是模型觉得容易的那一部分，零翻转属于幸存者偏差。两个数字因此必须同时报告，关闭推理时翻转率 0.508 而不可计分率为零，打开推理时翻转率为零而不可计分率 0.333。两种配置的唯一差异是输出上限由 8 提高到 2048，这一改动由模式本身强制而非选择，关闭推理时每次调用的推理开销约 23 个 token，打开后约 1440 个。该项到此为止，不再追加分支，TSRating 因而不进入基线清单，在全基线表中保留该行并标注不适用及上述理由。</w:t>
+      </w:r>
+    </w:p>
+    <w:p>
+      <w:pPr>
+        <w:ind w:firstLineChars="200" w:firstLine="420"/>
+      </w:pPr>
+      <w:r>
+        <w:rPr>
+          <w:rFonts w:hint="eastAsia"/>
+        </w:rPr>
         <w:t xml:space="preserve">打分族在缺失类缺陷上还有一处结构性局限，它在本文的语料上以一个可以预先算出的比例出现，因此写在这里而不是留作实现细节。这一族的方法把窗口展开为监督样本再打分，而监督样本无法承载缺失值，于是注入了缺失的窗口根本进不了它们的输入。该比例不是一个常数，它等于注入层在语料中的占比乘以七种缺陷中会产生缺失的两种，即注入层占比乘以七分之二。两份语料上的实测与该关系吻合，注入层占六成七的语料上为 19%，占三成七的语料上预测为 0.1057 而实测为 0.1060。报告这一关系比报告某一个比例更有用，因为它说明该族失效的范围随语料的含缺失比例而定，注入层占比越高，这一族无法处理的部分越大。本文的处理规则在任何分数产生之前定死，这些窗口不从比较中剔除，而是作为未被选中带进每个打分臂的整备语料，理由是给不出分数的窗口本来就留不住，这正是该族在此类数据上的真实行为。事前对它们插补的做法被否决，那会把本文算子的产物送进基线的输入，使基线在一份已经受过干预的语料上受评。该比例在主表中与选择比例并列给出，它也是打分族与本文方法在缺失类缺陷上产生差异的直接来源。</w:t>
+      </w:r>
+    </w:p>
+    <w:p>
+      <w:pPr>
+        <w:ind w:firstLineChars="200" w:firstLine="420"/>
+      </w:pPr>
+      <w:r>
+        <w:rPr>
+          <w:rFonts w:hint="eastAsia"/>
+        </w:rPr>
+        <w:t xml:space="preserve">打分族还有一处更基本的局限，它在混合来源的语料上才显现，此前的工作没有揭示。这一族产出的是分数，而分数本身不是尺度无关的。本文的语料同时含工业与金融两类来源，取值跨越三个数量级，直接按原始分数排序选取，实际选到的是量纲最大的那一批而不是质量最高的那一批。在两千窗口的语料上实测，按原始分数取前一半时，Data-OOB 从加密资产数据中选取的比例为零而从合成阶梯探针中选取的比例为一，LTSV 从加密资产与两类合成探针中选取的比例均为零而从电力变压器数据中选取百分之八十。TimeInf 受影响较轻，其选择集与下述修正口径的重合度为 0.956，而 Data-OOB 与 LTSV 分别只有 0.632 与 0.779。</w:t>
+      </w:r>
+    </w:p>
+    <w:p>
+      <w:pPr>
+        <w:ind w:firstLineChars="200" w:firstLine="420"/>
+      </w:pPr>
+      <w:r>
+        <w:rPr>
+          <w:rFonts w:hint="eastAsia"/>
+        </w:rPr>
+        <w:t xml:space="preserve">一个自然的想法是先对分数作标准化，但这不产生任何差别。全局标准化是单调变换，而选择只依赖排序，实测三个方法在标准化前后给出的选择集完全相同。本文因此改为在每个数据集内部按分数排秩并归一化，再合并各数据集的秩来选取。这一处理不改动任何方法的计算，只改变跨数据集的合并方式，与 4.1.2 节中变点层与困难层所用的族内秩是同一做法，理由也相同，两组统计量不共享尺度时无法用单一阈值或单一全局次序合并。</w:t>
+      </w:r>
+    </w:p>
+    <w:p>
+      <w:pPr>
+        <w:ind w:firstLineChars="200" w:firstLine="420"/>
+      </w:pPr>
+      <w:r>
+        <w:rPr>
+          <w:rFonts w:hint="eastAsia"/>
+        </w:rPr>
+        <w:t xml:space="preserve">这一现象本身构成一项发现而不只是一处实现细节。已有的样本估值方法都在单一来源的语料上报告结果，其分数的尺度敏感性因而不会暴露，而面向基础模型的语料整备本就要合并多个来源，这一局限在该设定下才成为问题。本文将其如实记录，并把修正口径与原始口径的选择结果并列给出。</w:t>
       </w:r>
     </w:p>
     <w:p/>

</xml_diff>